<commit_message>
Episode 1 rewrite: AI voice-over optimized names — Iyiocha→Idoro, Ohia Nso→Oso, Ozioma→Zara, Elder Amuka→Elder Maka, Ekene→Kene, Eze Amanze→Eze Amadi, Igweudo→Udo, Ojiaku→Oji, Obiajulu→Obi (short form only)
Co-Authored-By: Claude <noreply@anthropic.com>
</commit_message>
<xml_diff>
--- a/episodes/The_Dark_Rise_Episode_01.docx
+++ b/episodes/The_Dark_Rise_Episode_01.docx
@@ -93,35 +93,35 @@
           <ns0:sz ns0:val="24"/>
           <ns0:szCs ns0:val="24"/>
         </ns0:rPr>
-        <ns0:t xml:space="preserve">Amara's screams cut through the village of Iyiocha like a dull blade — slow, ragged, wrong. She had been in labor since sunrise. Now it was deep night. The oil lamps in her hut burned low. They threw shadows against the mud walls. Shadows that moved when they should not have moved.</ns0:t>
-      </ns0:r>
-    </ns0:p>
-    <ns0:p>
-      <ns0:pPr>
-        <ns0:spacing ns0:after="60" ns0:line="360"/>
-        <ns0:ind ns0:firstLine="360"/>
-      </ns0:pPr>
-      <ns0:r>
-        <ns0:rPr>
-          <ns0:rFonts ns0:ascii="Georgia" ns0:hAnsi="Georgia" ns0:cs="Georgia"/>
-          <ns0:sz ns0:val="24"/>
-          <ns0:szCs ns0:val="24"/>
-        </ns0:rPr>
-        <ns0:t xml:space="preserve">Ozioma the midwife pressed a damp cloth to Amara's forehead. Her old hands were steady. Her eyes were not.</ns0:t>
-      </ns0:r>
-    </ns0:p>
-    <ns0:p>
-      <ns0:pPr>
-        <ns0:spacing ns0:after="60" ns0:line="360"/>
-        <ns0:ind ns0:firstLine="360"/>
-      </ns0:pPr>
-      <ns0:r>
-        <ns0:rPr>
-          <ns0:rFonts ns0:ascii="Georgia" ns0:hAnsi="Georgia" ns0:cs="Georgia"/>
-          <ns0:sz ns0:val="24"/>
-          <ns0:szCs ns0:val="24"/>
-        </ns0:rPr>
-        <ns0:t xml:space="preserve">"Push," Ozioma said. "Again."</ns0:t>
+        <ns0:t xml:space="preserve">Amara's screams cut through the village of Idoro like a dull blade — slow, ragged, wrong. She had been in labor since sunrise. Now it was deep night. The oil lamps in her hut burned low. They threw shadows against the mud walls. Shadows that moved when they should not have moved.</ns0:t>
+      </ns0:r>
+    </ns0:p>
+    <ns0:p>
+      <ns0:pPr>
+        <ns0:spacing ns0:after="60" ns0:line="360"/>
+        <ns0:ind ns0:firstLine="360"/>
+      </ns0:pPr>
+      <ns0:r>
+        <ns0:rPr>
+          <ns0:rFonts ns0:ascii="Georgia" ns0:hAnsi="Georgia" ns0:cs="Georgia"/>
+          <ns0:sz ns0:val="24"/>
+          <ns0:szCs ns0:val="24"/>
+        </ns0:rPr>
+        <ns0:t xml:space="preserve">Zara the midwife pressed a damp cloth to Amara's forehead. Her old hands were steady. Her eyes were not.</ns0:t>
+      </ns0:r>
+    </ns0:p>
+    <ns0:p>
+      <ns0:pPr>
+        <ns0:spacing ns0:after="60" ns0:line="360"/>
+        <ns0:ind ns0:firstLine="360"/>
+      </ns0:pPr>
+      <ns0:r>
+        <ns0:rPr>
+          <ns0:rFonts ns0:ascii="Georgia" ns0:hAnsi="Georgia" ns0:cs="Georgia"/>
+          <ns0:sz ns0:val="24"/>
+          <ns0:szCs ns0:val="24"/>
+        </ns0:rPr>
+        <ns0:t xml:space="preserve">"Push," Zara said. "Again."</ns0:t>
       </ns0:r>
     </ns0:p>
     <ns0:p>
@@ -177,7 +177,7 @@
           <ns0:sz ns0:val="24"/>
           <ns0:szCs ns0:val="24"/>
         </ns0:rPr>
-        <ns0:t xml:space="preserve">A boy. Strong lungs. He wailed into the night and the sound was clean and good and alive. Ozioma lifted him. She tied off the cord. She wrapped him in soft cloth the color of sunrise.</ns0:t>
+        <ns0:t xml:space="preserve">A boy. Strong lungs. He wailed into the night and the sound was clean and good and alive. Zara lifted him. She tied off the cord. She wrapped him in soft cloth the color of sunrise.</ns0:t>
       </ns0:r>
     </ns0:p>
     <ns0:p>
@@ -219,7 +219,7 @@
           <ns0:sz ns0:val="24"/>
           <ns0:szCs ns0:val="24"/>
         </ns0:rPr>
-        <ns0:t xml:space="preserve">Ozioma looked down. Her blood went cold.</ns0:t>
+        <ns0:t xml:space="preserve">Zara looked down. Her blood went cold.</ns0:t>
       </ns0:r>
     </ns0:p>
     <ns0:p>
@@ -274,7 +274,7 @@
           <ns0:sz ns0:val="24"/>
           <ns0:szCs ns0:val="24"/>
         </ns0:rPr>
-        <ns0:t xml:space="preserve">He was an old man. No one remembered his true name. They called him Dibia. He wore a necklace of cowrie shells and small bones that clicked when he walked. He had delivered prophecies in Iyiocha for forty years, presiding over births and deaths and the spaces between.</ns0:t>
+        <ns0:t xml:space="preserve">He was an old man. No one remembered his true name. They called him Dibia. He wore a necklace of cowrie shells and small bones that clicked when he walked. He had delivered prophecies in Idoro for forty years, presiding over births and deaths and the spaces between.</ns0:t>
       </ns0:r>
     </ns0:p>
     <ns0:p>
@@ -316,7 +316,7 @@
           <ns0:sz ns0:val="24"/>
           <ns0:szCs ns0:val="24"/>
         </ns0:rPr>
-        <ns0:t xml:space="preserve">Ozioma held the second twin up. A boy. Smaller than his brother. His chest moved with breath. But he did not cry.</ns0:t>
+        <ns0:t xml:space="preserve">Zara held the second twin up. A boy. Smaller than his brother. His chest moved with breath. But he did not cry.</ns0:t>
       </ns0:r>
     </ns0:p>
     <ns0:p>
@@ -344,21 +344,21 @@
           <ns0:sz ns0:val="24"/>
           <ns0:szCs ns0:val="24"/>
         </ns0:rPr>
-        <ns0:t xml:space="preserve">Newborns do not open their eyes. Not like that. Not looking at you. Not looking through you. Not with a stillness that made Ozioma's stomach knot like wet rope.</ns0:t>
-      </ns0:r>
-    </ns0:p>
-    <ns0:p>
-      <ns0:pPr>
-        <ns0:spacing ns0:after="60" ns0:line="360"/>
-        <ns0:ind ns0:firstLine="360"/>
-      </ns0:pPr>
-      <ns0:r>
-        <ns0:rPr>
-          <ns0:rFonts ns0:ascii="Georgia" ns0:hAnsi="Georgia" ns0:cs="Georgia"/>
-          <ns0:sz ns0:val="24"/>
-          <ns0:szCs ns0:val="24"/>
-        </ns0:rPr>
-        <ns0:t xml:space="preserve">"Twins," Ozioma whispered.</ns0:t>
+        <ns0:t xml:space="preserve">Newborns do not open their eyes. Not like that. Not looking at you. Not looking through you. Not with a stillness that made Zara's stomach knot like wet rope.</ns0:t>
+      </ns0:r>
+    </ns0:p>
+    <ns0:p>
+      <ns0:pPr>
+        <ns0:spacing ns0:after="60" ns0:line="360"/>
+        <ns0:ind ns0:firstLine="360"/>
+      </ns0:pPr>
+      <ns0:r>
+        <ns0:rPr>
+          <ns0:rFonts ns0:ascii="Georgia" ns0:hAnsi="Georgia" ns0:cs="Georgia"/>
+          <ns0:sz ns0:val="24"/>
+          <ns0:szCs ns0:val="24"/>
+        </ns0:rPr>
+        <ns0:t xml:space="preserve">"Twins," Zara whispered.</ns0:t>
       </ns0:r>
     </ns0:p>
     <ns0:p>
@@ -455,21 +455,21 @@
           <ns0:sz ns0:val="24"/>
           <ns0:szCs ns0:val="24"/>
         </ns0:rPr>
-        <ns0:t xml:space="preserve">Elder Amuka came with the morning.</ns0:t>
-      </ns0:r>
-    </ns0:p>
-    <ns0:p>
-      <ns0:pPr>
-        <ns0:spacing ns0:after="60" ns0:line="360"/>
-        <ns0:ind ns0:firstLine="360"/>
-      </ns0:pPr>
-      <ns0:r>
-        <ns0:rPr>
-          <ns0:rFonts ns0:ascii="Georgia" ns0:hAnsi="Georgia" ns0:cs="Georgia"/>
-          <ns0:sz ns0:val="24"/>
-          <ns0:szCs ns0:val="24"/>
-        </ns0:rPr>
-        <ns0:t xml:space="preserve">She was the oldest woman in Iyiocha. She had enforced the old law for sixty years. Her face was a map of rulings she could not take back. She walked with a staff of dark wood polished smooth by decades of grip. Her wrappa was the deep red of dried blood. The morning sun caught the grey in her hair and made it look like a crown of iron.</ns0:t>
+        <ns0:t xml:space="preserve">Elder Maka came with the morning.</ns0:t>
+      </ns0:r>
+    </ns0:p>
+    <ns0:p>
+      <ns0:pPr>
+        <ns0:spacing ns0:after="60" ns0:line="360"/>
+        <ns0:ind ns0:firstLine="360"/>
+      </ns0:pPr>
+      <ns0:r>
+        <ns0:rPr>
+          <ns0:rFonts ns0:ascii="Georgia" ns0:hAnsi="Georgia" ns0:cs="Georgia"/>
+          <ns0:sz ns0:val="24"/>
+          <ns0:szCs ns0:val="24"/>
+        </ns0:rPr>
+        <ns0:t xml:space="preserve">She was the oldest woman in Idoro. She had enforced the old law for sixty years. Her face was a map of rulings she could not take back. She walked with a staff of dark wood polished smooth by decades of grip. Her wrappa was the deep red of dried blood. The morning sun caught the grey in her hair and made it look like a crown of iron.</ns0:t>
       </ns0:r>
     </ns0:p>
     <ns0:p>
@@ -497,7 +497,7 @@
           <ns0:sz ns0:val="24"/>
           <ns0:szCs ns0:val="24"/>
         </ns0:rPr>
-        <ns0:t xml:space="preserve">"How many?" Elder Amuka asked.</ns0:t>
+        <ns0:t xml:space="preserve">"How many?" Elder Maka asked.</ns0:t>
       </ns0:r>
     </ns0:p>
     <ns0:p>
@@ -553,7 +553,7 @@
           <ns0:sz ns0:val="24"/>
           <ns0:szCs ns0:val="24"/>
         </ns0:rPr>
-        <ns0:t xml:space="preserve">Elder Amuka closed her eyes. When she opened them, something in her face had turned to stone.</ns0:t>
+        <ns0:t xml:space="preserve">Elder Maka closed her eyes. When she opened them, something in her face had turned to stone.</ns0:t>
       </ns0:r>
     </ns0:p>
     <ns0:p>
@@ -608,7 +608,7 @@
           <ns0:sz ns0:val="24"/>
           <ns0:szCs ns0:val="24"/>
         </ns0:rPr>
-        <ns0:t xml:space="preserve">He had been a strong man once. A fisherman who could wrestle a tarpon from the delta waters with his bare hands. He had survived storms that swallowed boats whole. He had looked into the black mouth of the Ojiaku during flood season and dared it to take him.</ns0:t>
+        <ns0:t xml:space="preserve">He had been a strong man once. A fisherman who could wrestle a tarpon from the delta waters with his bare hands. He had survived storms that swallowed boats whole. He had looked into the black mouth of the Oji during flood season and dared it to take him.</ns0:t>
       </ns0:r>
     </ns0:p>
     <ns0:p>
@@ -650,7 +650,7 @@
           <ns0:sz ns0:val="24"/>
           <ns0:szCs ns0:val="24"/>
         </ns0:rPr>
-        <ns0:t xml:space="preserve">Elder Amuka did not look at him. She kept her eyes on the infant whose eyes were still open. Still watching.</ns0:t>
+        <ns0:t xml:space="preserve">Elder Maka did not look at him. She kept her eyes on the infant whose eyes were still open. Still watching.</ns0:t>
       </ns0:r>
     </ns0:p>
     <ns0:p>
@@ -719,21 +719,21 @@
           <ns0:sz ns0:val="24"/>
           <ns0:szCs ns0:val="24"/>
         </ns0:rPr>
-        <ns0:t xml:space="preserve">Everyone in Iyiocha had seen.</ns0:t>
-      </ns0:r>
-    </ns0:p>
-    <ns0:p>
-      <ns0:pPr>
-        <ns0:spacing ns0:after="60" ns0:line="360"/>
-        <ns0:ind ns0:firstLine="360"/>
-      </ns0:pPr>
-      <ns0:r>
-        <ns0:rPr>
-          <ns0:rFonts ns0:ascii="Georgia" ns0:hAnsi="Georgia" ns0:cs="Georgia"/>
-          <ns0:sz ns0:val="24"/>
-          <ns0:szCs ns0:val="24"/>
-        </ns0:rPr>
-        <ns0:t xml:space="preserve">There had been a family. Three villages over. Five years ago. They kept their abiku. They named her. They loved her. They defied the old law and Elder Amuka herself.</ns0:t>
+        <ns0:t xml:space="preserve">Everyone in Idoro had seen.</ns0:t>
+      </ns0:r>
+    </ns0:p>
+    <ns0:p>
+      <ns0:pPr>
+        <ns0:spacing ns0:after="60" ns0:line="360"/>
+        <ns0:ind ns0:firstLine="360"/>
+      </ns0:pPr>
+      <ns0:r>
+        <ns0:rPr>
+          <ns0:rFonts ns0:ascii="Georgia" ns0:hAnsi="Georgia" ns0:cs="Georgia"/>
+          <ns0:sz ns0:val="24"/>
+          <ns0:szCs ns0:val="24"/>
+        </ns0:rPr>
+        <ns0:t xml:space="preserve">There had been a family. Three villages over. Five years ago. They kept their abiku. They named her. They loved her. They defied the old law and Elder Maka herself.</ns0:t>
       </ns0:r>
     </ns0:p>
     <ns0:p>
@@ -816,7 +816,7 @@
           <ns0:sz ns0:val="24"/>
           <ns0:szCs ns0:val="24"/>
         </ns0:rPr>
-        <ns0:t xml:space="preserve">They named the first-born Ekene.</ns0:t>
+        <ns0:t xml:space="preserve">They named the first-born Kene.</ns0:t>
       </ns0:r>
     </ns0:p>
     <ns0:p>
@@ -955,7 +955,7 @@
           <ns0:sz ns0:val="24"/>
           <ns0:szCs ns0:val="24"/>
         </ns0:rPr>
-        <ns0:t xml:space="preserve">"The child will not suffer," the dibia said. "Ohia Nso takes quickly."</ns0:t>
+        <ns0:t xml:space="preserve">"The child will not suffer," the dibia said. "Oso takes quickly."</ns0:t>
       </ns0:r>
     </ns0:p>
     <ns0:p>
@@ -983,7 +983,7 @@
           <ns0:sz ns0:val="24"/>
           <ns0:szCs ns0:val="24"/>
         </ns0:rPr>
-        <ns0:t xml:space="preserve">Ohia Nso was the forbidden bush. Three miles past the village boundary. A place where trees grew twisted, where roots broke through the soil like the fingers of buried things. A place where birds did not sing and the ground was always cold, even under a burning noon sun. Hunters walked the long way around it. Children learned its boundaries before they learned the names of their own grandparents.</ns0:t>
+        <ns0:t xml:space="preserve">Oso was the forbidden bush. Three miles past the village boundary. A place where trees grew twisted, where roots broke through the soil like the fingers of buried things. A place where birds did not sing and the ground was always cold, even under a burning noon sun. Hunters walked the long way around it. Children learned its boundaries before they learned the names of their own grandparents.</ns0:t>
       </ns0:r>
     </ns0:p>
     <ns0:p>
@@ -1066,7 +1066,7 @@
           <ns0:sz ns0:val="24"/>
           <ns0:szCs ns0:val="24"/>
         </ns0:rPr>
-        <ns0:t xml:space="preserve">Ohia Nso was dark when the dibia reached its edge.</ns0:t>
+        <ns0:t xml:space="preserve">Oso was dark when the dibia reached its edge.</ns0:t>
       </ns0:r>
     </ns0:p>
     <ns0:p>
@@ -1108,7 +1108,7 @@
           <ns0:sz ns0:val="24"/>
           <ns0:szCs ns0:val="24"/>
         </ns0:rPr>
-        <ns0:t xml:space="preserve">No one entered Ohia Nso. Not the dibia. Not Elder Amuka. Not the Eze himself. The law said you left the child at the boundary. You did not step inside. What happened after that was between the child and whatever lived in the dark.</ns0:t>
+        <ns0:t xml:space="preserve">No one entered Oso. Not the dibia. Not Elder Maka. Not the Eze himself. The law said you left the child at the boundary. You did not step inside. What happened after that was between the child and whatever lived in the dark.</ns0:t>
       </ns0:r>
     </ns0:p>
     <ns0:p>
@@ -1415,7 +1415,7 @@
           <ns0:sz ns0:val="24"/>
           <ns0:szCs ns0:val="24"/>
         </ns0:rPr>
-        <ns0:t xml:space="preserve">That was the old compact. The forest gave nothing back. It received the cursed, the abandoned, the unwanted — and kept them. Every infant ever laid at its boundary. Dozens. Scores. More than anyone in Iyiocha remembered.</ns0:t>
+        <ns0:t xml:space="preserve">That was the old compact. The forest gave nothing back. It received the cursed, the abandoned, the unwanted — and kept them. Every infant ever laid at its boundary. Dozens. Scores. More than anyone in Idoro remembered.</ns0:t>
       </ns0:r>
     </ns0:p>
     <ns0:p>
@@ -1516,7 +1516,7 @@
           <ns0:bCs/>
           <ns0:caps/>
         </ns0:rPr>
-        <ns0:t xml:space="preserve">HOST STATUS: MARKED — THE ABANDONED CHILD OF IYIOCHA.</ns0:t>
+        <ns0:t xml:space="preserve">HOST STATUS: MARKED — THE ABANDONED CHILD OF IDORO.</ns0:t>
       </ns0:r>
     </ns0:p>
     <ns0:p>
@@ -1614,7 +1614,7 @@
           <ns0:sz ns0:val="24"/>
           <ns0:szCs ns0:val="24"/>
         </ns0:rPr>
-        <ns0:t xml:space="preserve">Three hundred miles away, Eze Amanze sat on the ancient throne of the Kingdom of Ijendu and heard nothing of this.</ns0:t>
+        <ns0:t xml:space="preserve">Three hundred miles away, Eze Amadi sat on the ancient throne of the Kingdom of Ijendu and heard nothing of this.</ns0:t>
       </ns0:r>
     </ns0:p>
     <ns0:p>
@@ -1656,7 +1656,7 @@
           <ns0:sz ns0:val="24"/>
           <ns0:szCs ns0:val="24"/>
         </ns0:rPr>
-        <ns0:t xml:space="preserve">Eze Amanze was sixty years old. He had ruled for twenty of them. His beard was grey and close-cut. His robes were purple and gold. His eyes were the kind of tired that sleep could not fix.</ns0:t>
+        <ns0:t xml:space="preserve">Eze Amadi was sixty years old. He had ruled for twenty of them. His beard was grey and close-cut. His robes were purple and gold. His eyes were the kind of tired that sleep could not fix.</ns0:t>
       </ns0:r>
     </ns0:p>
     <ns0:p>
@@ -1698,7 +1698,7 @@
           <ns0:sz ns0:val="24"/>
           <ns0:szCs ns0:val="24"/>
         </ns0:rPr>
-        <ns0:t xml:space="preserve">"Eze, the delta villages report strange signs. Fishermen near Iyiocha say the waters have gone still. No current. No fish. Elders say the trees in Ohia Nso have begun to grow toward each other. As if bowing to something at the center."</ns0:t>
+        <ns0:t xml:space="preserve">"Eze, the delta villages report strange signs. Fishermen near Idoro say the waters have gone still. No current. No fish. Elders say the trees in Oso have begun to grow toward each other. As if bowing to something at the center."</ns0:t>
       </ns0:r>
     </ns0:p>
     <ns0:p>
@@ -1782,7 +1782,7 @@
           <ns0:sz ns0:val="24"/>
           <ns0:szCs ns0:val="24"/>
         </ns0:rPr>
-        <ns0:t xml:space="preserve">Eze Amanze waved a hand. The gesture said: this audience is over. The gesture said: the Kingdom has real problems. Trade disputes. Nobles who would put a knife in his back for the throne. He did not have time for ghost stories from fishing villages.</ns0:t>
+        <ns0:t xml:space="preserve">Eze Amadi waved a hand. The gesture said: this audience is over. The gesture said: the Kingdom has real problems. Trade disputes. Nobles who would put a knife in his back for the throne. He did not have time for ghost stories from fishing villages.</ns0:t>
       </ns0:r>
     </ns0:p>
     <ns0:p>

</xml_diff>

<commit_message>
Episode 1 Pocket FM AI audio compliance pass — remove all hyphens (firstborn, secondborn, spirit child, iyi uwa, close cut), digits to words (Episode One), remove end markers from narration body per Section 2.5; update CLAUDE.md Section 8 to reconcile
</commit_message>
<xml_diff>
--- a/episodes/The_Dark_Rise_Episode_01.docx
+++ b/episodes/The_Dark_Rise_Episode_01.docx
@@ -43,7 +43,7 @@
           <ns0:sz ns0:val="26"/>
           <ns0:szCs ns0:val="26"/>
         </ns0:rPr>
-        <ns0:t xml:space="preserve">Episode 1</ns0:t>
+        <ns0:t xml:space="preserve">Episode One</ns0:t>
       </ns0:r>
     </ns0:p>
     <ns0:p>
@@ -191,7 +191,7 @@
           <ns0:sz ns0:val="24"/>
           <ns0:szCs ns0:val="24"/>
         </ns0:rPr>
-        <ns0:t xml:space="preserve">A healthy son. A first-born son. Amara wept with relief.</ns0:t>
+        <ns0:t xml:space="preserve">A healthy son. A firstborn son. Amara wept with relief.</ns0:t>
       </ns0:r>
     </ns0:p>
     <ns0:p>
@@ -386,49 +386,49 @@
           <ns0:sz ns0:val="24"/>
           <ns0:szCs ns0:val="24"/>
         </ns0:rPr>
-        <ns0:t xml:space="preserve">In the Kingdom of Ijendu, twins were not a double blessing. They were a sign. A rupture in the natural order. The old law said: when two are born together, one belongs to the living and one belongs to the spirits. An abiku. A spirit-child. A thing that would die and return, die and return, tormenting its bloodline until the family was ash or the iyi-uwa was found and shattered.</ns0:t>
-      </ns0:r>
-    </ns0:p>
-    <ns0:p>
-      <ns0:pPr>
-        <ns0:spacing ns0:after="60" ns0:line="360"/>
-        <ns0:ind ns0:firstLine="360"/>
-      </ns0:pPr>
-      <ns0:r>
-        <ns0:rPr>
-          <ns0:rFonts ns0:ascii="Georgia" ns0:hAnsi="Georgia" ns0:cs="Georgia"/>
-          <ns0:sz ns0:val="24"/>
-          <ns0:szCs ns0:val="24"/>
-        </ns0:rPr>
-        <ns0:t xml:space="preserve">The law said the second-born was the abiku.</ns0:t>
-      </ns0:r>
-    </ns0:p>
-    <ns0:p>
-      <ns0:pPr>
-        <ns0:spacing ns0:after="60" ns0:line="360"/>
-        <ns0:ind ns0:firstLine="360"/>
-      </ns0:pPr>
-      <ns0:r>
-        <ns0:rPr>
-          <ns0:rFonts ns0:ascii="Georgia" ns0:hAnsi="Georgia" ns0:cs="Georgia"/>
-          <ns0:sz ns0:val="24"/>
-          <ns0:szCs ns0:val="24"/>
-        </ns0:rPr>
-        <ns0:t xml:space="preserve">The law said the second-born must be taken to the forbidden bush.</ns0:t>
-      </ns0:r>
-    </ns0:p>
-    <ns0:p>
-      <ns0:pPr>
-        <ns0:spacing ns0:after="60" ns0:line="360"/>
-        <ns0:ind ns0:firstLine="360"/>
-      </ns0:pPr>
-      <ns0:r>
-        <ns0:rPr>
-          <ns0:rFonts ns0:ascii="Georgia" ns0:hAnsi="Georgia" ns0:cs="Georgia"/>
-          <ns0:sz ns0:val="24"/>
-          <ns0:szCs ns0:val="24"/>
-        </ns0:rPr>
-        <ns0:t xml:space="preserve">The law said the second-born must not return.</ns0:t>
+        <ns0:t xml:space="preserve">In the Kingdom of Ijendu, twins were not a double blessing. They were a sign. A rupture in the natural order. The old law said: when two are born together, one belongs to the living and one belongs to the spirits. An abiku. A spirit child. A thing that would die and return, die and return, tormenting its bloodline until the family was ash or the iyi uwa was found and shattered.</ns0:t>
+      </ns0:r>
+    </ns0:p>
+    <ns0:p>
+      <ns0:pPr>
+        <ns0:spacing ns0:after="60" ns0:line="360"/>
+        <ns0:ind ns0:firstLine="360"/>
+      </ns0:pPr>
+      <ns0:r>
+        <ns0:rPr>
+          <ns0:rFonts ns0:ascii="Georgia" ns0:hAnsi="Georgia" ns0:cs="Georgia"/>
+          <ns0:sz ns0:val="24"/>
+          <ns0:szCs ns0:val="24"/>
+        </ns0:rPr>
+        <ns0:t xml:space="preserve">The law said the secondborn was the abiku.</ns0:t>
+      </ns0:r>
+    </ns0:p>
+    <ns0:p>
+      <ns0:pPr>
+        <ns0:spacing ns0:after="60" ns0:line="360"/>
+        <ns0:ind ns0:firstLine="360"/>
+      </ns0:pPr>
+      <ns0:r>
+        <ns0:rPr>
+          <ns0:rFonts ns0:ascii="Georgia" ns0:hAnsi="Georgia" ns0:cs="Georgia"/>
+          <ns0:sz ns0:val="24"/>
+          <ns0:szCs ns0:val="24"/>
+        </ns0:rPr>
+        <ns0:t xml:space="preserve">The law said the secondborn must be taken to the forbidden bush.</ns0:t>
+      </ns0:r>
+    </ns0:p>
+    <ns0:p>
+      <ns0:pPr>
+        <ns0:spacing ns0:after="60" ns0:line="360"/>
+        <ns0:ind ns0:firstLine="360"/>
+      </ns0:pPr>
+      <ns0:r>
+        <ns0:rPr>
+          <ns0:rFonts ns0:ascii="Georgia" ns0:hAnsi="Georgia" ns0:cs="Georgia"/>
+          <ns0:sz ns0:val="24"/>
+          <ns0:szCs ns0:val="24"/>
+        </ns0:rPr>
+        <ns0:t xml:space="preserve">The law said the secondborn must not return.</ns0:t>
       </ns0:r>
     </ns0:p>
     <ns0:p>
@@ -816,7 +816,7 @@
           <ns0:sz ns0:val="24"/>
           <ns0:szCs ns0:val="24"/>
         </ns0:rPr>
-        <ns0:t xml:space="preserve">They named the first-born Kene.</ns0:t>
+        <ns0:t xml:space="preserve">They named the firstborn Kene.</ns0:t>
       </ns0:r>
     </ns0:p>
     <ns0:p>
@@ -844,7 +844,7 @@
           <ns0:sz ns0:val="24"/>
           <ns0:szCs ns0:val="24"/>
         </ns0:rPr>
-        <ns0:t xml:space="preserve">They did not name the second-born.</ns0:t>
+        <ns0:t xml:space="preserve">They did not name the secondborn.</ns0:t>
       </ns0:r>
     </ns0:p>
     <ns0:p>
@@ -1656,7 +1656,7 @@
           <ns0:sz ns0:val="24"/>
           <ns0:szCs ns0:val="24"/>
         </ns0:rPr>
-        <ns0:t xml:space="preserve">Eze Amadi was sixty years old. He had ruled for twenty of them. His beard was grey and close-cut. His robes were purple and gold. His eyes were the kind of tired that sleep could not fix.</ns0:t>
+        <ns0:t xml:space="preserve">Eze Amadi was sixty years old. He had ruled for twenty of them. His beard was grey and close cut. His robes were purple and gold. His eyes were the kind of tired that sleep could not fix.</ns0:t>
       </ns0:r>
     </ns0:p>
     <ns0:p>
@@ -1991,36 +1991,6 @@
           <ns0:szCs ns0:val="24"/>
         </ns0:rPr>
         <ns0:t xml:space="preserve"/>
-      </ns0:r>
-    </ns0:p>
-    <ns0:p>
-      <ns0:pPr>
-        <ns0:spacing ns0:after="120" ns0:line="360"/>
-        <ns0:jc ns0:val="center"/>
-      </ns0:pPr>
-      <ns0:r>
-        <ns0:rPr>
-          <ns0:rFonts ns0:ascii="Georgia" ns0:hAnsi="Georgia" ns0:cs="Georgia"/>
-          <ns0:sz ns0:val="24"/>
-          <ns0:szCs ns0:val="24"/>
-          <ns0:b/>
-          <ns0:bCs/>
-        </ns0:rPr>
-        <ns0:t xml:space="preserve">End of Episode 1</ns0:t>
-      </ns0:r>
-    </ns0:p>
-    <ns0:p>
-      <ns0:pPr>
-        <ns0:spacing ns0:after="0" ns0:line="360"/>
-        <ns0:jc ns0:val="center"/>
-      </ns0:pPr>
-      <ns0:r>
-        <ns0:rPr>
-          <ns0:rFonts ns0:ascii="Georgia" ns0:hAnsi="Georgia" ns0:cs="Georgia"/>
-          <ns0:sz ns0:val="22"/>
-          <ns0:szCs ns0:val="22"/>
-        </ns0:rPr>
-        <ns0:t xml:space="preserve">Next: Episode 2 — "The Hunger Begins"</ns0:t>
       </ns0:r>
     </ns0:p>
     <ns0:sectPr>

</xml_diff>

<commit_message>
Episode 1: rename akpu tree → Ak'pu tree; add to name registry
Co-Authored-By: Claude <noreply@anthropic.com>
</commit_message>
<xml_diff>
--- a/episodes/The_Dark_Rise_Episode_01.docx
+++ b/episodes/The_Dark_Rise_Episode_01.docx
@@ -1122,7 +1122,7 @@
           <ns0:sz ns0:val="24"/>
           <ns0:szCs ns0:val="24"/>
         </ns0:rPr>
-        <ns0:t xml:space="preserve">He laid the bundle at the base of an akpu tree. The cloth was white. In the fading light, it glowed like a small ghost.</ns0:t>
+        <ns0:t xml:space="preserve">He laid the bundle at the base of an Ak'pu tree. The cloth was white. In the fading light, it glowed like a small ghost.</ns0:t>
       </ns0:r>
     </ns0:p>
     <ns0:p>
@@ -1851,7 +1851,7 @@
           <ns0:sz ns0:val="24"/>
           <ns0:szCs ns0:val="24"/>
         </ns0:rPr>
-        <ns0:t xml:space="preserve">The infant lay at the base of the akpu tree. The white cloth was soaked with dew. The air was cold.</ns0:t>
+        <ns0:t xml:space="preserve">The infant lay at the base of the Ak'pu tree. The white cloth was soaked with dew. The air was cold.</ns0:t>
       </ns0:r>
     </ns0:p>
     <ns0:p>

</xml_diff>

<commit_message>
Episode 1: remove iyi uwa concept; rename Ak'pu → ak-pu tree
- Removed iyi uwa from episode body text
- Removed iyi uwa from name registry (Titles/Concepts)
- Updated Power System and Literary Texture sections in CLAUDE.md
- Renamed Ak'pu tree → ak-pu tree throughout

Co-Authored-By: Claude <noreply@anthropic.com>
</commit_message>
<xml_diff>
--- a/episodes/The_Dark_Rise_Episode_01.docx
+++ b/episodes/The_Dark_Rise_Episode_01.docx
@@ -386,7 +386,7 @@
           <ns0:sz ns0:val="24"/>
           <ns0:szCs ns0:val="24"/>
         </ns0:rPr>
-        <ns0:t xml:space="preserve">In the Kingdom of Ijendu, twins were not a double blessing. They were a sign. A rupture in the natural order. The old law said: when two are born together, one belongs to the living and one belongs to the spirits. An abiku. A spirit child. A thing that would die and return, die and return, tormenting its bloodline until the family was ash or the iyi uwa was found and shattered.</ns0:t>
+        <ns0:t xml:space="preserve">In the Kingdom of Ijendu, twins were not a double blessing. They were a sign. A rupture in the natural order. The old law said: when two are born together, one belongs to the living and one belongs to the spirits. An abiku. A spirit child. A thing that would die and return, die and return, tormenting its bloodline until the family was ash.</ns0:t>
       </ns0:r>
     </ns0:p>
     <ns0:p>
@@ -1122,7 +1122,7 @@
           <ns0:sz ns0:val="24"/>
           <ns0:szCs ns0:val="24"/>
         </ns0:rPr>
-        <ns0:t xml:space="preserve">He laid the bundle at the base of an Ak'pu tree. The cloth was white. In the fading light, it glowed like a small ghost.</ns0:t>
+        <ns0:t xml:space="preserve">He laid the bundle at the base of an ak-pu tree. The cloth was white. In the fading light, it glowed like a small ghost.</ns0:t>
       </ns0:r>
     </ns0:p>
     <ns0:p>
@@ -1851,7 +1851,7 @@
           <ns0:sz ns0:val="24"/>
           <ns0:szCs ns0:val="24"/>
         </ns0:rPr>
-        <ns0:t xml:space="preserve">The infant lay at the base of the Ak'pu tree. The white cloth was soaked with dew. The air was cold.</ns0:t>
+        <ns0:t xml:space="preserve">The infant lay at the base of the ak-pu tree. The white cloth was soaked with dew. The air was cold.</ns0:t>
       </ns0:r>
     </ns0:p>
     <ns0:p>

</xml_diff>

<commit_message>
Maintenance pass: rename ak-pu tree to iroko for TTS clarity; fix continuity bookkeeping and add audio-name rules
- Global rename ak-pu → iroko (80 occurrences, 51 episode files, all build
  scripts, ARCHIVE.md, CLAUDE.md) — old name violated the no-hyphen rule
  and was unreliable in AI narration
- CLAUDE.md: add Section 5.1 (audio confusable-name rules) and Section 5.2
  (who-knows-what dramatic irony ledger)
- Fix stale archive-split notes (registry through Ep78, changelog through
  Ep83), registry header now "as of Episode 100", ARCHIVE.md changelog
  header 1-63 → 1-83, de-stale its tail note
- Correct Ep87 changelog entry: household has never heard the name
  "Ijoma Concern" on the page
- Label changelog dates as scheduled release dates; fix Section 8
  "Ohia Nso" → "Oso"; fix Section 12 push target main → master

Co-Authored-By: Claude Fable 5 <noreply@anthropic.com>
</commit_message>
<xml_diff>
--- a/episodes/The_Dark_Rise_Episode_01.docx
+++ b/episodes/The_Dark_Rise_Episode_01.docx
@@ -1122,7 +1122,7 @@
           <ns0:sz ns0:val="24"/>
           <ns0:szCs ns0:val="24"/>
         </ns0:rPr>
-        <ns0:t xml:space="preserve">He laid the bundle at the base of an ak-pu tree. The cloth was white. In the fading light, it glowed like a small ghost.</ns0:t>
+        <ns0:t xml:space="preserve">He laid the bundle at the base of an iroko tree. The cloth was white. In the fading light, it glowed like a small ghost.</ns0:t>
       </ns0:r>
     </ns0:p>
     <ns0:p>
@@ -1851,7 +1851,7 @@
           <ns0:sz ns0:val="24"/>
           <ns0:szCs ns0:val="24"/>
         </ns0:rPr>
-        <ns0:t xml:space="preserve">The infant lay at the base of the ak-pu tree. The white cloth was soaked with dew. The air was cold.</ns0:t>
+        <ns0:t xml:space="preserve">The infant lay at the base of the iroko tree. The white cloth was soaked with dew. The air was cold.</ns0:t>
       </ns0:r>
     </ns0:p>
     <ns0:p>

</xml_diff>